<commit_message>
Corrige variaveis dos contratos
</commit_message>
<xml_diff>
--- a/output/templates-docx/contrato_tributario.docx
+++ b/output/templates-docx/contrato_tributario.docx
@@ -244,7 +244,7 @@
           <w:color w:val="000000"/>
           <w:sz w:val="24"/>
         </w:rPr>
-        <w:t xml:space="preserve"> {NACIONALIDADE}, inscrita(o) no CPF sob o nº.</w:t>
+        <w:t xml:space="preserve"> {NACIONALIDADE}, {ESTADO_CIVIL}, {PROFISSAO}, inscrita(o) no CPF sob o nº.</w:t>
       </w:r>
       <w:r>
         <w:rPr>
@@ -264,7 +264,7 @@
           <w:color w:val="000000"/>
           <w:sz w:val="24"/>
         </w:rPr>
-        <w:t xml:space="preserve"> residente e domiciliado na </w:t>
+        <w:t xml:space="preserve"> residente e domiciliado na {ENDERECO_COMPLETO}, </w:t>
       </w:r>
     </w:p>
     <w:tbl>

</xml_diff>